<commit_message>
updating plotting figure and outputting thermal safety margin excel sheets
</commit_message>
<xml_diff>
--- a/notes feb 8 2024.docx
+++ b/notes feb 8 2024.docx
@@ -47,30 +47,65 @@
       </w:r>
     </w:p>
     <w:p>
-      <w:r>
+      <w:pPr>
+        <w:rPr>
+          <w:highlight w:val="red"/>
+        </w:rPr>
+      </w:pPr>
+      <w:r>
+        <w:rPr>
+          <w:highlight w:val="red"/>
+        </w:rPr>
         <w:t xml:space="preserve">Remake new </w:t>
       </w:r>
       <w:proofErr w:type="spellStart"/>
       <w:r>
+        <w:rPr>
+          <w:highlight w:val="red"/>
+        </w:rPr>
         <w:t>geom_density</w:t>
       </w:r>
       <w:proofErr w:type="spellEnd"/>
       <w:r>
-        <w:t xml:space="preserve"> figure to be </w:t>
+        <w:rPr>
+          <w:highlight w:val="red"/>
+        </w:rPr>
+        <w:t xml:space="preserve"> figure to be alphabetically</w:t>
+      </w:r>
+      <w:r>
+        <w:rPr>
+          <w:highlight w:val="red"/>
+        </w:rPr>
+        <w:t xml:space="preserve"> </w:t>
       </w:r>
       <w:proofErr w:type="gramStart"/>
       <w:r>
-        <w:t>alphabetically</w:t>
+        <w:rPr>
+          <w:highlight w:val="red"/>
+        </w:rPr>
+        <w:t>Done</w:t>
       </w:r>
       <w:proofErr w:type="gramEnd"/>
     </w:p>
     <w:p>
       <w:r>
-        <w:t xml:space="preserve">Output means values of thermal safety margins to be used in </w:t>
+        <w:rPr>
+          <w:highlight w:val="red"/>
+        </w:rPr>
+        <w:t>Output means values of thermal safety margins to be used in stats</w:t>
+      </w:r>
+      <w:r>
+        <w:rPr>
+          <w:highlight w:val="red"/>
+        </w:rPr>
+        <w:t xml:space="preserve"> </w:t>
       </w:r>
       <w:proofErr w:type="gramStart"/>
       <w:r>
-        <w:t>stats</w:t>
+        <w:rPr>
+          <w:highlight w:val="red"/>
+        </w:rPr>
+        <w:t>DONE</w:t>
       </w:r>
       <w:proofErr w:type="gramEnd"/>
     </w:p>

</xml_diff>

<commit_message>
adding thermal safety margin stats into heat_tolerance_stats code
</commit_message>
<xml_diff>
--- a/notes feb 8 2024.docx
+++ b/notes feb 8 2024.docx
@@ -110,31 +110,57 @@
       <w:proofErr w:type="gramEnd"/>
     </w:p>
     <w:p>
-      <w:r>
+      <w:pPr>
+        <w:rPr>
+          <w:highlight w:val="red"/>
+        </w:rPr>
+      </w:pPr>
+      <w:r>
+        <w:rPr>
+          <w:highlight w:val="red"/>
+        </w:rPr>
         <w:t xml:space="preserve">Thermal safety margin stats – analysis on mean values of </w:t>
       </w:r>
       <w:proofErr w:type="spellStart"/>
       <w:r>
+        <w:rPr>
+          <w:highlight w:val="red"/>
+        </w:rPr>
         <w:t>tcrit</w:t>
       </w:r>
       <w:proofErr w:type="spellEnd"/>
       <w:r>
+        <w:rPr>
+          <w:highlight w:val="red"/>
+        </w:rPr>
         <w:t xml:space="preserve"> v leaf and </w:t>
       </w:r>
       <w:proofErr w:type="spellStart"/>
       <w:r>
+        <w:rPr>
+          <w:highlight w:val="red"/>
+        </w:rPr>
         <w:t>tcrit</w:t>
       </w:r>
       <w:proofErr w:type="spellEnd"/>
       <w:r>
+        <w:rPr>
+          <w:highlight w:val="red"/>
+        </w:rPr>
         <w:t xml:space="preserve"> v air – do this in </w:t>
       </w:r>
       <w:proofErr w:type="spellStart"/>
       <w:r>
+        <w:rPr>
+          <w:highlight w:val="red"/>
+        </w:rPr>
         <w:t>heat_tolerance_</w:t>
       </w:r>
       <w:proofErr w:type="gramStart"/>
       <w:r>
+        <w:rPr>
+          <w:highlight w:val="red"/>
+        </w:rPr>
         <w:t>stats</w:t>
       </w:r>
       <w:proofErr w:type="spellEnd"/>
@@ -142,10 +168,16 @@
     </w:p>
     <w:p>
       <w:r>
+        <w:rPr>
+          <w:highlight w:val="red"/>
+        </w:rPr>
         <w:t xml:space="preserve">Then paired t-test of safety margin leaf v safety margin </w:t>
       </w:r>
       <w:proofErr w:type="gramStart"/>
       <w:r>
+        <w:rPr>
+          <w:highlight w:val="red"/>
+        </w:rPr>
         <w:t>air</w:t>
       </w:r>
       <w:proofErr w:type="gramEnd"/>

</xml_diff>